<commit_message>
Update manuscript with GitHub repository URL
</commit_message>
<xml_diff>
--- a/Manuscript.docx
+++ b/Manuscript.docx
@@ -362,7 +362,7 @@
           <w:i w:val="0"/>
           <w:sz w:val="24"/>
         </w:rPr>
-        <w:t>Data were obtained from the ClinicalTrials.gov API v2 (https://clinicaltrials.gov/api/v2/studies), maintained by the U.S. National Library of Medicine. A multi-term combinatorial search strategy was implemented to maximize retrieval sensitivity. Five vertigo-related condition terms (vertigo, dizziness, vertiginous, dizzy, Meniere) were cross-combined with seven acupuncture-related intervention terms (acupuncture, electroacupuncture, acupoint, moxibustion, acupressure, auricular acupuncture, ear acupuncture), yielding 35 discrete search term pairs. Each pair was submitted as a query.term parameter to the API, which performs full-text matching across all study record fields. A supplementary broad condition search (query: "vertigo OR dizziness OR Meniere") was concurrently executed to capture the total volume of vertigo-related studies in the registry, which serves as the denominator for proportion calculations. The search was performed on July 1, 2026. Following NCT ID-based deduplication, all unique study records were retained for subsequent analysis. The complete list of 35 query strings and API request parameters is provided in Supplementary Table S1. All data fetching and analysis code is publicly available at [GitHub repository URL] with a permanent DOI issued via Zenodo.</w:t>
+        <w:t>Data were obtained from the ClinicalTrials.gov API v2 (https://clinicaltrials.gov/api/v2/studies), maintained by the U.S. National Library of Medicine. A multi-term combinatorial search strategy was implemented to maximize retrieval sensitivity. Five vertigo-related condition terms (vertigo, dizziness, vertiginous, dizzy, Meniere) were cross-combined with seven acupuncture-related intervention terms (acupuncture, electroacupuncture, acupoint, moxibustion, acupressure, auricular acupuncture, ear acupuncture), yielding 35 discrete search term pairs. Each pair was submitted as a query.term parameter to the API, which performs full-text matching across all study record fields. A supplementary broad condition search (query: "vertigo OR dizziness OR Meniere") was concurrently executed to capture the total volume of vertigo-related studies in the registry, which serves as the denominator for proportion calculations. The search was performed on July 1, 2026. Following NCT ID-based deduplication, all unique study records were retained for subsequent analysis. The complete list of 35 query strings and API request parameters is provided in Supplementary Table S1. All data fetching and analysis code is publicly available at https://github.com/1947314628-ui/acupuncture-vertigo-clinicaltrials-registry with a permanent DOI issued via Zenodo.</w:t>
       </w:r>
     </w:p>
     <w:p>
@@ -1345,7 +1345,7 @@
           <w:i w:val="0"/>
           <w:sz w:val="24"/>
         </w:rPr>
-        <w:t>Data availability: All data used in this study were obtained from the publicly accessible ClinicalTrials.gov API v2 (https://clinicaltrials.gov/api/v2/studies). The complete analysis pipeline — including API data fetching scripts, entity extraction code with all regular expression patterns and entity dictionaries, figure generation scripts, and processed summary datasets — is publicly available at [GitHub repository URL] with a permanent DOI issued via Zenodo. Running 00_full_fetch.py followed by 02_preprocess_fixed.py and 00_regenerate_figures.py reproduces all results and figures from the live ClinicalTrials.gov API.</w:t>
+        <w:t>Data availability: All data used in this study were obtained from the publicly accessible ClinicalTrials.gov API v2 (https://clinicaltrials.gov/api/v2/studies). The complete analysis pipeline — including API data fetching scripts, entity extraction code with all regular expression patterns and entity dictionaries, figure generation scripts, and processed summary datasets — is publicly available at https://github.com/1947314628-ui/acupuncture-vertigo-clinicaltrials-registry with a permanent DOI issued via Zenodo. Running 00_full_fetch.py followed by 02_preprocess_fixed.py and 00_regenerate_figures.py reproduces all results and figures from the live ClinicalTrials.gov API.</w:t>
       </w:r>
     </w:p>
     <w:p>

</xml_diff>

<commit_message>
Update corresponding author to Chuyun Chen (chencyzwl@126.com)
</commit_message>
<xml_diff>
--- a/Manuscript.docx
+++ b/Manuscript.docx
@@ -42,7 +42,7 @@
           <w:i w:val="0"/>
           <w:sz w:val="24"/>
         </w:rPr>
-        <w:t>Qin Zhang¹*, Tong Yin², Yueping Huang³, Chuyun Chen¹</w:t>
+        <w:t>Qin Zhang¹, Tong Yin², Yueping Huang³, Chuyun Chen¹</w:t>
       </w:r>
     </w:p>
     <w:p>
@@ -123,7 +123,7 @@
           <w:i w:val="0"/>
           <w:sz w:val="20"/>
         </w:rPr>
-        <w:t xml:space="preserve">  Qin Zhang</w:t>
+        <w:t>Chuyun Chen</w:t>
       </w:r>
     </w:p>
     <w:p>
@@ -137,7 +137,7 @@
           <w:i w:val="0"/>
           <w:sz w:val="20"/>
         </w:rPr>
-        <w:t xml:space="preserve">  E-mail: zhangqin@stu.gzucm.edu.cn</w:t>
+        <w:t xml:space="preserve">  E-mail: chencyzwl@126.com</w:t>
       </w:r>
     </w:p>
     <w:p>
@@ -1333,7 +1333,7 @@
           <w:i w:val="0"/>
           <w:sz w:val="24"/>
         </w:rPr>
-        <w:t>Qin Zhang¹*, Tong Yin², Yueping Huang³, Chuyun Chen¹</w:t>
+        <w:t>Qin Zhang¹, Tong Yin², Yueping Huang³, Chuyun Chen¹</w:t>
       </w:r>
     </w:p>
     <w:p>

</xml_diff>

<commit_message>
Add Zenodo DOI: 10.5281/zenodo.21110651
</commit_message>
<xml_diff>
--- a/Manuscript.docx
+++ b/Manuscript.docx
@@ -362,7 +362,7 @@
           <w:i w:val="0"/>
           <w:sz w:val="24"/>
         </w:rPr>
-        <w:t>Data were obtained from the ClinicalTrials.gov API v2 (https://clinicaltrials.gov/api/v2/studies), maintained by the U.S. National Library of Medicine. A multi-term combinatorial search strategy was implemented to maximize retrieval sensitivity. Five vertigo-related condition terms (vertigo, dizziness, vertiginous, dizzy, Meniere) were cross-combined with seven acupuncture-related intervention terms (acupuncture, electroacupuncture, acupoint, moxibustion, acupressure, auricular acupuncture, ear acupuncture), yielding 35 discrete search term pairs. Each pair was submitted as a query.term parameter to the API, which performs full-text matching across all study record fields. A supplementary broad condition search (query: "vertigo OR dizziness OR Meniere") was concurrently executed to capture the total volume of vertigo-related studies in the registry, which serves as the denominator for proportion calculations. The search was performed on July 1, 2026. Following NCT ID-based deduplication, all unique study records were retained for subsequent analysis. The complete list of 35 query strings and API request parameters is provided in Supplementary Table S1. All data fetching and analysis code is publicly available at https://github.com/1947314628-ui/acupuncture-vertigo-clinicaltrials-registry with a permanent DOI issued via Zenodo.</w:t>
+        <w:t>Data were obtained from the ClinicalTrials.gov API v2 (https://clinicaltrials.gov/api/v2/studies), maintained by the U.S. National Library of Medicine. A multi-term combinatorial search strategy was implemented to maximize retrieval sensitivity. Five vertigo-related condition terms (vertigo, dizziness, vertiginous, dizzy, Meniere) were cross-combined with seven acupuncture-related intervention terms (acupuncture, electroacupuncture, acupoint, moxibustion, acupressure, auricular acupuncture, ear acupuncture), yielding 35 discrete search term pairs. Each pair was submitted as a query.term parameter to the API, which performs full-text matching across all study record fields. A supplementary broad condition search (query: "vertigo OR dizziness OR Meniere") was concurrently executed to capture the total volume of vertigo-related studies in the registry, which serves as the denominator for proportion calculations. The search was performed on July 1, 2026. Following NCT ID-based deduplication, all unique study records were retained for subsequent analysis. The complete list of 35 query strings and API request parameters is provided in Supplementary Table S1. All data fetching and analysis code is publicly available at https://github.com/1947314628-ui/acupuncture-vertigo-clinicaltrials-registry with a permanent DOI issued via Zenodo (10.5281/zenodo.21110651).</w:t>
       </w:r>
     </w:p>
     <w:p>
@@ -1345,7 +1345,7 @@
           <w:i w:val="0"/>
           <w:sz w:val="24"/>
         </w:rPr>
-        <w:t>Data availability: All data used in this study were obtained from the publicly accessible ClinicalTrials.gov API v2 (https://clinicaltrials.gov/api/v2/studies). The complete analysis pipeline — including API data fetching scripts, entity extraction code with all regular expression patterns and entity dictionaries, figure generation scripts, and processed summary datasets — is publicly available at https://github.com/1947314628-ui/acupuncture-vertigo-clinicaltrials-registry with a permanent DOI issued via Zenodo. Running 00_full_fetch.py followed by 02_preprocess_fixed.py and 00_regenerate_figures.py reproduces all results and figures from the live ClinicalTrials.gov API.</w:t>
+        <w:t>Data availability: All data used in this study were obtained from the publicly accessible ClinicalTrials.gov API v2 (https://clinicaltrials.gov/api/v2/studies). The complete analysis pipeline — including API data fetching scripts, entity extraction code with all regular expression patterns and entity dictionaries, figure generation scripts, and processed summary datasets — is publicly available at https://github.com/1947314628-ui/acupuncture-vertigo-clinicaltrials-registry with a permanent DOI issued via Zenodo (10.5281/zenodo.21110651). Running 00_full_fetch.py followed by 02_preprocess_fixed.py and 00_regenerate_figures.py reproduces all results and figures from the live ClinicalTrials.gov API.</w:t>
       </w:r>
     </w:p>
     <w:p>

</xml_diff>

<commit_message>
Update funding statement with funder roles per Frontiers requirements
</commit_message>
<xml_diff>
--- a/Manuscript.docx
+++ b/Manuscript.docx
@@ -1309,7 +1309,7 @@
           <w:i w:val="0"/>
           <w:sz w:val="24"/>
         </w:rPr>
-        <w:t>Funding: This work was supported by the Guangzhou TCM Intelligent Scientific Research Platform, National Demonstration Project for the Inheritance and Innovation of Traditional Chinese Medicine (Grant No. ZJXZ2026005). Additional support was provided by the following projects: (1) National Advantage Specialty Construction Project (Guo Zhong Yi Yao Yi Zheng Han [2024] No. 90); (2) Guangdong Provincial Famous TCM Practitioner Inheritance Studio Construction Project (Yue Zhong Yi Ban Han [2023] No. 108); (3) Guangzhou TCM Advantage Specialty Construction Project (Sui Wei Han [2023] No. 2316); (4) Guangzhou TCM Clinical Core and Characteristic Diagnosis and Treatment Technology Construction Project (Sui Wei Han [2022] No. 2249); (5) Clinical Observation of Acupuncture for Acute Ischemic Stroke and Its Effect on NF-κB/iNOS Pathway (Grant No. 20242A011009); (6) Guangdong Provincial TCM Bureau Research Project — Observation of the Therapeutic Effect of "Xing Nao Qi He Tiao Shu" Method on Gut Microbiota in Patients with Cognitive Impairment Due to Cerebral Small Vessel Disease (Grant No. 20231275); (7) Guangzhou Science and Technology Plan Project — Development of an Intelligent Acupuncture Consultation System Based on Continuous Dialogue (Grant No. 2024A03J0793).</w:t>
+        <w:t>Funding: This work was supported by the Guangzhou TCM Intelligent Scientific Research Platform, National Demonstration Project for the Inheritance and Innovation of Traditional Chinese Medicine (Grant No. ZJXZ2026005), which provided the computational infrastructure and data analysis resources. Additional institutional support was provided by: (1) the National Advantage Specialty Construction Project (Guo Zhong Yi Yao Yi Zheng Han [2024] No. 90); (2) the Guangdong Provincial Famous TCM Practitioner Inheritance Studio Construction Project (Yue Zhong Yi Ban Han [2023] No. 108); (3) the Guangzhou TCM Advantage Specialty Construction Project (Sui Wei Han [2023] No. 2316); (4) the Guangzhou TCM Clinical Core and Characteristic Diagnosis and Treatment Technology Construction Project (Sui Wei Han [2022] No. 2249); (5) the Clinical Observation of Acupuncture for Acute Ischemic Stroke and Its Effect on NF-κB/iNOS Pathway (Grant No. 20242A011009); (6) the Guangdong Provincial TCM Bureau Research Project — Observation of the Therapeutic Effect of "Xing Nao Qi He Tiao Shu" Method on Gut Microbiota in Patients with Cognitive Impairment Due to Cerebral Small Vessel Disease (Grant No. 20231275); and (7) the Guangzhou Science and Technology Plan Project — Development of an Intelligent Acupuncture Consultation System Based on Continuous Dialogue (Grant No. 2024A03J0793). These funders provided general institutional and departmental research support. The funders had no role in study design, data collection and analysis, decision to publish, or preparation of the manuscript.</w:t>
       </w:r>
     </w:p>
     <w:p>
@@ -1646,7 +1646,7 @@
                     <pic:cNvPicPr/>
                   </pic:nvPicPr>
                   <pic:blipFill>
-                    <a:blip r:embed="rId23"/>
+                    <a:blip r:embed="rId24"/>
                     <a:stretch>
                       <a:fillRect/>
                     </a:stretch>

</xml_diff>

<commit_message>
Fix abstract and ref DOI
</commit_message>
<xml_diff>
--- a/Manuscript.docx
+++ b/Manuscript.docx
@@ -237,7 +237,7 @@
           <w:i w:val="0"/>
           <w:sz w:val="24"/>
         </w:rPr>
-        <w:t>Conclusions: The number of confirmed acupuncture-vertigo trials registered in ClinicalTrials.gov (n = 29) is modest relative to the high prevalence of vertigo, highlighting an opportunity to strengthen the evidence base through well-designed, prospectively registered trials. The text mining analytical framework — with its accompanying code repository, entity dictionaries, and regular expression patterns — is transferable to other acupuncture research domains. Findings are limited to ClinicalTrials.gov and may not fully capture trials in regional registries, particularly the Chinese Clinical Trial Registry.</w:t>
+        <w:t>Conclusions: The number of confirmed acupuncture-vertigo trials registered in ClinicalTrials.gov (n = 29) is modest relative to the high prevalence of vertigo, suggesting a need for additional well-designed registered trials. The text mining analytical framework — with its accompanying code repository, entity dictionaries, and regular expression patterns — is transferable to other acupuncture research domains. Findings are limited to ClinicalTrials.gov and may not fully capture trials in regional registries, particularly the Chinese Clinical Trial Registry.</w:t>
       </w:r>
     </w:p>
     <w:p>
@@ -1593,7 +1593,7 @@
           <w:i w:val="0"/>
           <w:sz w:val="20"/>
         </w:rPr>
-        <w:t>19. Vora LK, Kuruvilla M, et al. Applying natural language processing to ClinicalTrials.gov: mRNA cancer vaccine case study. Clin Transl Sci. 2023.</w:t>
+        <w:t>19. Vora LK, Kuruvilla M, Kim C, Wu M, Shemesh CS, Roth GA. Applying natural language processing to ClinicalTrials.gov: mRNA cancer vaccine case study. Clin Transl Sci. 2023;16(12):2417-2420. doi:10.1111/cts.13648</w:t>
       </w:r>
     </w:p>
     <w:p>

</xml_diff>